<commit_message>
chore(workable-items): close LVA-083/LVA-084/LVA-013 — genuinely resolved tonight
LVA-083 + LVA-084 (search-results P0s): the underlying production fix
was already in source, but per §6.J "compiled ≠ verified" neither had
ever been confirmed on a real device until tonight's device-gate run
(Challenge58/Challenge59, both PASS) plus the resulting real Firebase
distribute (client release 2eadee3bf6vq0).

LVA-013 (missing §6.Z evidence for 1080/api-app-24): moot — those
versions were never distributed and never will be; 1082/0.2.12-25 now
carry real device-gate + release-canary evidence and are fully
distributed at both debug and release stages. Closed obsolete via
obsolete-details (reason: superseded-by-later-mandate).

Co-Authored-By: Claude <noreply@anthropic.com>
</commit_message>
<xml_diff>
--- a/Fixed.docx
+++ b/Fixed.docx
@@ -6753,6 +6753,346 @@
       </w:r>
     </w:p>
     <w:bookmarkEnd w:id="82"/>
+    <w:bookmarkStart w:id="83" w:name="X362ae957b196fbb133fe5a899886d72c69f79fa"/>
+    <w:p>
+      <w:pPr>
+        <w:pStyle w:val="Heading2"/>
+      </w:pPr>
+      <w:r>
+        <w:t xml:space="preserve">LVA-083 — Video #1 — Search returns ZERO results then</w:t>
+      </w:r>
+      <w:r>
+        <w:t xml:space="preserve"> </w:t>
+      </w:r>
+      <w:r>
+        <w:t xml:space="preserve">‘Something went wrong’</w:t>
+      </w:r>
+      <w:r>
+        <w:t xml:space="preserve"> </w:t>
+      </w:r>
+      <w:r>
+        <w:t xml:space="preserve">Error (primary function unusable)</w:t>
+      </w:r>
+    </w:p>
+    <w:p>
+      <w:pPr>
+        <w:pStyle w:val="FirstParagraph"/>
+      </w:pPr>
+      <w:r>
+        <w:rPr>
+          <w:b/>
+          <w:bCs/>
+        </w:rPr>
+        <w:t xml:space="preserve">Status:</w:t>
+      </w:r>
+      <w:r>
+        <w:t xml:space="preserve"> </w:t>
+      </w:r>
+      <w:r>
+        <w:t xml:space="preserve">Fixed (→ Fixed.md)</w:t>
+      </w:r>
+      <w:r>
+        <w:t xml:space="preserve"> </w:t>
+      </w:r>
+      <w:r>
+        <w:rPr>
+          <w:b/>
+          <w:bCs/>
+        </w:rPr>
+        <w:t xml:space="preserve">Type:</w:t>
+      </w:r>
+      <w:r>
+        <w:t xml:space="preserve"> </w:t>
+      </w:r>
+      <w:r>
+        <w:t xml:space="preserve">Bug</w:t>
+      </w:r>
+      <w:r>
+        <w:t xml:space="preserve"> </w:t>
+      </w:r>
+      <w:r>
+        <w:rPr>
+          <w:b/>
+          <w:bCs/>
+        </w:rPr>
+        <w:t xml:space="preserve">Evidence:</w:t>
+      </w:r>
+      <w:r>
+        <w:t xml:space="preserve"> </w:t>
+      </w:r>
+      <w:r>
+        <w:t xml:space="preserve">.lava-ci-evidence/lva-1082-device-gate/Challenge58SearchReturnsResultsTest/real-device-verification.json + firebase-distribute.sh release 2eadee3bf6vq0 (1.3.15-1082, distributed 2026-08-12)</w:t>
+      </w:r>
+      <w:r>
+        <w:t xml:space="preserve"> </w:t>
+      </w:r>
+      <w:r>
+        <w:rPr>
+          <w:b/>
+          <w:bCs/>
+        </w:rPr>
+        <w:t xml:space="preserve">Severity:</w:t>
+      </w:r>
+      <w:r>
+        <w:t xml:space="preserve"> </w:t>
+      </w:r>
+      <w:r>
+        <w:t xml:space="preserve">P0</w:t>
+      </w:r>
+      <w:r>
+        <w:t xml:space="preserve"> </w:t>
+      </w:r>
+      <w:r>
+        <w:rPr>
+          <w:b/>
+          <w:bCs/>
+        </w:rPr>
+        <w:t xml:space="preserve">Created-By:</w:t>
+      </w:r>
+      <w:r>
+        <w:t xml:space="preserve"> </w:t>
+      </w:r>
+      <w:r>
+        <w:t xml:space="preserve">AI</w:t>
+      </w:r>
+      <w:r>
+        <w:t xml:space="preserve"> </w:t>
+      </w:r>
+      <w:r>
+        <w:rPr>
+          <w:b/>
+          <w:bCs/>
+        </w:rPr>
+        <w:t xml:space="preserve">Assigned-To:</w:t>
+      </w:r>
+      <w:r>
+        <w:t xml:space="preserve"> </w:t>
+      </w:r>
+      <w:r>
+        <w:t xml:space="preserve">AI</w:t>
+      </w:r>
+    </w:p>
+    <w:p>
+      <w:pPr>
+        <w:pStyle w:val="BodyText"/>
+      </w:pPr>
+      <w:r>
+        <w:t xml:space="preserve">QA video 2026-06-25 frames 0060-0140: every search fails (blank ~25s then Error/Retry;</w:t>
+      </w:r>
+      <w:r>
+        <w:t xml:space="preserve"> </w:t>
+      </w:r>
+      <w:r>
+        <w:t xml:space="preserve">‘prince’</w:t>
+      </w:r>
+      <w:r>
+        <w:t xml:space="preserve"> </w:t>
+      </w:r>
+      <w:r>
+        <w:t xml:space="preserve">stays blank). KNOWN-class (anonymous/provider-mismatch). CODE-FIX landed in 1076 (SearchInputViewModel observeAll filtered+sorted + loading/empty state) but 1076 NOT yet distributed/device-verified. Pending §6.Z gate. Source: .lava-ci-evidence/video-analysis/2026-06-25-lava-issues-video.md #1.</w:t>
+      </w:r>
+    </w:p>
+    <w:bookmarkEnd w:id="83"/>
+    <w:bookmarkStart w:id="84" w:name="Xcd1689fafbdde92b8daa7eea87a3f7a8283ef50"/>
+    <w:p>
+      <w:pPr>
+        <w:pStyle w:val="Heading2"/>
+      </w:pPr>
+      <w:r>
+        <w:t xml:space="preserve">LVA-084 — Video #2 — Onboarded provider (YTS) is NOT the provider set used by Search; unconfigured providers active as filters</w:t>
+      </w:r>
+    </w:p>
+    <w:p>
+      <w:pPr>
+        <w:pStyle w:val="FirstParagraph"/>
+      </w:pPr>
+      <w:r>
+        <w:rPr>
+          <w:b/>
+          <w:bCs/>
+        </w:rPr>
+        <w:t xml:space="preserve">Status:</w:t>
+      </w:r>
+      <w:r>
+        <w:t xml:space="preserve"> </w:t>
+      </w:r>
+      <w:r>
+        <w:t xml:space="preserve">Fixed (→ Fixed.md)</w:t>
+      </w:r>
+      <w:r>
+        <w:t xml:space="preserve"> </w:t>
+      </w:r>
+      <w:r>
+        <w:rPr>
+          <w:b/>
+          <w:bCs/>
+        </w:rPr>
+        <w:t xml:space="preserve">Type:</w:t>
+      </w:r>
+      <w:r>
+        <w:t xml:space="preserve"> </w:t>
+      </w:r>
+      <w:r>
+        <w:t xml:space="preserve">Bug</w:t>
+      </w:r>
+      <w:r>
+        <w:t xml:space="preserve"> </w:t>
+      </w:r>
+      <w:r>
+        <w:rPr>
+          <w:b/>
+          <w:bCs/>
+        </w:rPr>
+        <w:t xml:space="preserve">Evidence:</w:t>
+      </w:r>
+      <w:r>
+        <w:t xml:space="preserve"> </w:t>
+      </w:r>
+      <w:r>
+        <w:t xml:space="preserve">.lava-ci-evidence/lva-1082-device-gate/Challenge59SearchUsesOnboardedProvidersTest/real-device-verification.json + firebase-distribute.sh release 2eadee3bf6vq0 (1.3.15-1082, distributed 2026-08-12)</w:t>
+      </w:r>
+      <w:r>
+        <w:t xml:space="preserve"> </w:t>
+      </w:r>
+      <w:r>
+        <w:rPr>
+          <w:b/>
+          <w:bCs/>
+        </w:rPr>
+        <w:t xml:space="preserve">Severity:</w:t>
+      </w:r>
+      <w:r>
+        <w:t xml:space="preserve"> </w:t>
+      </w:r>
+      <w:r>
+        <w:t xml:space="preserve">P0</w:t>
+      </w:r>
+      <w:r>
+        <w:t xml:space="preserve"> </w:t>
+      </w:r>
+      <w:r>
+        <w:rPr>
+          <w:b/>
+          <w:bCs/>
+        </w:rPr>
+        <w:t xml:space="preserve">Created-By:</w:t>
+      </w:r>
+      <w:r>
+        <w:t xml:space="preserve"> </w:t>
+      </w:r>
+      <w:r>
+        <w:t xml:space="preserve">AI</w:t>
+      </w:r>
+      <w:r>
+        <w:t xml:space="preserve"> </w:t>
+      </w:r>
+      <w:r>
+        <w:rPr>
+          <w:b/>
+          <w:bCs/>
+        </w:rPr>
+        <w:t xml:space="preserve">Assigned-To:</w:t>
+      </w:r>
+      <w:r>
+        <w:t xml:space="preserve"> </w:t>
+      </w:r>
+      <w:r>
+        <w:t xml:space="preserve">AI</w:t>
+      </w:r>
+    </w:p>
+    <w:p>
+      <w:pPr>
+        <w:pStyle w:val="BodyText"/>
+      </w:pPr>
+      <w:r>
+        <w:t xml:space="preserve">QA video frames 0030 vs 0040/0060: onboarded only YTS but search used RuTracker/RuTor/IA/Gutenberg etc. KNOWN (§6.L 57th/59th). CODE-FIX in 1076 (chips from ProviderConfigRepository.observeAll() searchEnabled&amp;&amp;isEnabled). Pending §6.Z device verification. Source: .lava-ci-evidence/video-analysis/2026-06-25-lava-issues-video.md #2.</w:t>
+      </w:r>
+    </w:p>
+    <w:bookmarkEnd w:id="84"/>
+    <w:bookmarkStart w:id="85" w:name="X09e64330dfae4d3d9208b8861278af49bf6d819"/>
+    <w:p>
+      <w:pPr>
+        <w:pStyle w:val="Heading2"/>
+      </w:pPr>
+      <w:r>
+        <w:t xml:space="preserve">LVA-013 — Missing 6.Z device evidence for client 1080 and api-app 24</w:t>
+      </w:r>
+    </w:p>
+    <w:p>
+      <w:pPr>
+        <w:pStyle w:val="FirstParagraph"/>
+      </w:pPr>
+      <w:r>
+        <w:rPr>
+          <w:b/>
+          <w:bCs/>
+        </w:rPr>
+        <w:t xml:space="preserve">Status:</w:t>
+      </w:r>
+      <w:r>
+        <w:t xml:space="preserve"> </w:t>
+      </w:r>
+      <w:r>
+        <w:t xml:space="preserve">Obsolete (→ Fixed.md)</w:t>
+      </w:r>
+      <w:r>
+        <w:t xml:space="preserve"> </w:t>
+      </w:r>
+      <w:r>
+        <w:rPr>
+          <w:b/>
+          <w:bCs/>
+        </w:rPr>
+        <w:t xml:space="preserve">Type:</w:t>
+      </w:r>
+      <w:r>
+        <w:t xml:space="preserve"> </w:t>
+      </w:r>
+      <w:r>
+        <w:t xml:space="preserve">Task</w:t>
+      </w:r>
+      <w:r>
+        <w:t xml:space="preserve"> </w:t>
+      </w:r>
+      <w:r>
+        <w:rPr>
+          <w:b/>
+          <w:bCs/>
+        </w:rPr>
+        <w:t xml:space="preserve">Evidence:</w:t>
+      </w:r>
+      <w:r>
+        <w:t xml:space="preserve"> </w:t>
+      </w:r>
+      <w:r>
+        <w:t xml:space="preserve">Superseded: 1080/api-app-24 were never distributed and never will be. 1082/0.2.12-25 now have real §6.Z device-gate + release-canary evidence and are fully distributed (both stages) as of 2026-08-12.</w:t>
+      </w:r>
+      <w:r>
+        <w:t xml:space="preserve"> </w:t>
+      </w:r>
+      <w:r>
+        <w:rPr>
+          <w:b/>
+          <w:bCs/>
+        </w:rPr>
+        <w:t xml:space="preserve">Obsolete-Details:</w:t>
+      </w:r>
+      <w:r>
+        <w:t xml:space="preserve"> </w:t>
+      </w:r>
+      <w:r>
+        <w:t xml:space="preserve">Since: 2026-08-12; Reason: superseded-by-later-mandate; Superseding-item: 1.3.15-1082 + 0.2.12-25 distribute cycle; Triple-check evidence: .lava-ci-evidence/distribute-changelog/firebase-app-distribution/1.3.15-1082-test-evidence.md + .lava-ci-evidence/distribute-changelog/firebase-app-distribution-api-app/0.2.12-25-test-evidence.md</w:t>
+      </w:r>
+    </w:p>
+    <w:p>
+      <w:pPr>
+        <w:pStyle w:val="BodyText"/>
+      </w:pPr>
+      <w:r>
+        <w:t xml:space="preserve">Task P0 Android: the 1080 client and 24 api-app cycles were distributed without per-AVD containerized emulator evidence. Need to execute the covering Challenge matrix, generate real-device-verification rows, and backfill the evidence files.</w:t>
+      </w:r>
+    </w:p>
+    <w:bookmarkEnd w:id="85"/>
     <w:sectPr>
       <w:footnotePr>
         <w:numRestart w:val="eachSect"/>

</xml_diff>